<commit_message>
courts: docx re-rendered on the regenerated references (262 model folders; 36 move a page end, 35 still pass XENG); W. Va. Supreme Court brief-on-the-merits docx reported like latex: LibreOffice moves note 3's mark line on with it, fb-595.54.11.4 (fb-595.54.11.2)
Co-Authored-By: Claude Opus 5.5 <noreply@anthropic.com>
Gate: fb-595-54-11-2-a3 2d8b76c3cfcd308aacd63f83fdba033aa542a307
</commit_message>
<xml_diff>
--- a/courts/dc-circuit/district-of-columbia/state/court-of-appeals/motion-brief/usage/OUTPUT-motion-brief.docx
+++ b/courts/dc-circuit/district-of-columbia/state/court-of-appeals/motion-brief/usage/OUTPUT-motion-brief.docx
@@ -125,9 +125,7 @@
           <w:b/>
           <w:bCs/>
         </w:rPr>
-        <w:t xml:space="preserve">14-CV</w:t>
-        <w:noBreakHyphen/>
-        <w:t xml:space="preserve">249</w:t>
+        <w:t xml:space="preserve">14-CV-⁠249</w:t>
       </w:r>
     </w:p>
     <w:p>
@@ -974,13 +972,7 @@
         <w:pStyle w:val="BodyText"/>
       </w:pPr>
       <w:r>
-        <w:t xml:space="preserve">On February 18, 2014, two days before they had moved BEGA to dismiss the administrative proceedings, Walker and Tyson filed a complaint in Superior Court, alleging that BEGA lacks jurisdiction to pursue charges against them. Compl. ¶¶ 18-⁠28. The complaint seeks an order (1) enjoining BEGA’s ongoing enforcement action against Walker and Tyson and (2) fully reinstating them to their positions at OAH. Compl. 11</w:t>
-      </w:r>
-      <w:r>
-        <w:noBreakHyphen/>
-      </w:r>
-      <w:r>
-        <w:t xml:space="preserve">12. Walker and Tyson also filed motions for a temporary restraining order and a preliminary injunction on the same day, seeking the same relief. Judge John Bayly denied the motion for a temporary restraining order on February 20, 2014.</w:t>
+        <w:t xml:space="preserve">On February 18, 2014, two days before they had moved BEGA to dismiss the administrative proceedings, Walker and Tyson filed a complaint in Superior Court, alleging that BEGA lacks jurisdiction to pursue charges against them. Compl. ¶¶ 18-⁠28. The complaint seeks an order (1) enjoining BEGA’s ongoing enforcement action against Walker and Tyson and (2) fully reinstating them to their positions at OAH. Compl. 11-⁠12. Walker and Tyson also filed motions for a temporary restraining order and a preliminary injunction on the same day, seeking the same relief. Judge John Bayly denied the motion for a temporary restraining order on February 20, 2014.</w:t>
       </w:r>
     </w:p>
     <w:p>
@@ -988,13 +980,7 @@
         <w:pStyle w:val="BodyText"/>
       </w:pPr>
       <w:r>
-        <w:t xml:space="preserve">On March 7, 2014, Judge Brian Holeman held a hearing on the motion for a preliminary injunction and indicated that he would grant the motion, explaining that an order would follow thereafter. He also denied the District’s oral motion for a stay of his order pending appeal. Judge Holeman issued his order today, ordering (1) “that [BEGA] shall take no further action and is hereby enjoined from proceeding in any manner with the matter captioned In Re: Mary Oates Walker and Kiyo Oden Tyson, Case No. 1060</w:t>
-      </w:r>
-      <w:r>
-        <w:noBreakHyphen/>
-      </w:r>
-      <w:r>
-        <w:t xml:space="preserve">001”; and (2) “that Mayor Vincent C. Gray is hereby enjoined from taking any further action to remove or terminate Mary Oates Walker as the District of Columbia Office of Administrative Hearings Chief Administrative Law Judge or in any way altering her current employment status and receipt of pay and benefits.” Order (attached as Exhibit 1 to this motion). The District immediately noted an appeal,</w:t>
+        <w:t xml:space="preserve">On March 7, 2014, Judge Brian Holeman held a hearing on the motion for a preliminary injunction and indicated that he would grant the motion, explaining that an order would follow thereafter. He also denied the District’s oral motion for a stay of his order pending appeal. Judge Holeman issued his order today, ordering (1) “that [BEGA] shall take no further action and is hereby enjoined from proceeding in any manner with the matter captioned In Re: Mary Oates Walker and Kiyo Oden Tyson, Case No. 1060-⁠001”; and (2) “that Mayor Vincent C. Gray is hereby enjoined from taking any further action to remove or terminate Mary Oates Walker as the District of Columbia Office of Administrative Hearings Chief Administrative Law Judge or in any way altering her current employment status and receipt of pay and benefits.” Order (attached as Exhibit 1 to this motion). The District immediately noted an appeal,</w:t>
       </w:r>
       <w:r>
         <w:t xml:space="preserve"> </w:t>
@@ -1160,13 +1146,7 @@
         <w:t xml:space="preserve">Abadie v. D.C. Contract Appeals Bd.</w:t>
       </w:r>
       <w:r>
-        <w:t xml:space="preserve">, 843 A.2d 738, 742</w:t>
-      </w:r>
-      <w:r>
-        <w:noBreakHyphen/>
-      </w:r>
-      <w:r>
-        <w:t xml:space="preserve">43 (D.C. 2004) (quoting</w:t>
+        <w:t xml:space="preserve">, 843 A.2d 738, 742-⁠43 (D.C. 2004) (quoting</w:t>
       </w:r>
       <w:r>
         <w:t xml:space="preserve"> </w:t>
@@ -1208,13 +1188,7 @@
         <w:t xml:space="preserve">Bender</w:t>
       </w:r>
       <w:r>
-        <w:t xml:space="preserve">, 562 A.2d at 1209)). For the reasons in the District’s opposition to preliminary injunction, Opp. 12</w:t>
-      </w:r>
-      <w:r>
-        <w:noBreakHyphen/>
-      </w:r>
-      <w:r>
-        <w:t xml:space="preserve">21, as well as the motion for a full stay pending appeal to be filed tomorrow, that stringent showing cannot be made here. To the contrary, BEGA is fully authorized to assert jurisdiction to investigate plaintiffs’ alleged unethical conduct committed while serving as District officials and, if BEGA concludes it justified, to issue certain civil sanctions against plaintiffs for that conduct.</w:t>
+        <w:t xml:space="preserve">, 562 A.2d at 1209)). For the reasons in the District’s opposition to preliminary injunction, Opp. 12-⁠21, as well as the motion for a full stay pending appeal to be filed tomorrow, that stringent showing cannot be made here. To the contrary, BEGA is fully authorized to assert jurisdiction to investigate plaintiffs’ alleged unethical conduct committed while serving as District officials and, if BEGA concludes it justified, to issue certain civil sanctions against plaintiffs for that conduct.</w:t>
       </w:r>
     </w:p>
     <w:p>
@@ -1238,13 +1212,7 @@
         <w:t xml:space="preserve"> </w:t>
       </w:r>
       <w:r>
-        <w:t xml:space="preserve">Opp. 9</w:t>
-      </w:r>
-      <w:r>
-        <w:noBreakHyphen/>
-      </w:r>
-      <w:r>
-        <w:t xml:space="preserve">10. Because the Superior Court did not have jurisdiction to enter the injunction against BEGA (with regard to both appellees) or the Mayor (with regard to Walker), the District should plainly prevail on the merits on appeal.</w:t>
+        <w:t xml:space="preserve">Opp. 9-⁠10. Because the Superior Court did not have jurisdiction to enter the injunction against BEGA (with regard to both appellees) or the Mayor (with regard to Walker), the District should plainly prevail on the merits on appeal.</w:t>
       </w:r>
     </w:p>
     <w:p>
@@ -1352,13 +1320,7 @@
         <w:t xml:space="preserve"> </w:t>
       </w:r>
       <w:r>
-        <w:t xml:space="preserve">Board of Ethics and Government Accountability Establishment and Comprehensive Ethics Reform Amendment Act of 2011, D.C. Law 19</w:t>
-      </w:r>
-      <w:r>
-        <w:noBreakHyphen/>
-      </w:r>
-      <w:r>
-        <w:t xml:space="preserve">124, D.C. Code § 1-⁠1161.01</w:t>
+        <w:t xml:space="preserve">Board of Ethics and Government Accountability Establishment and Comprehensive Ethics Reform Amendment Act of 2011, D.C. Law 19-⁠124, D.C. Code § 1-⁠1161.01</w:t>
       </w:r>
       <w:r>
         <w:t xml:space="preserve"> </w:t>
@@ -1714,9 +1676,7 @@
         <w:t xml:space="preserve"> </w:t>
       </w:r>
       <w:r>
-        <w:t xml:space="preserve">727</w:t>
-        <w:noBreakHyphen/>
-        <w:t xml:space="preserve">6287</w:t>
+        <w:t xml:space="preserve">727-⁠6287</w:t>
       </w:r>
     </w:p>
     <w:p>
@@ -2108,9 +2068,7 @@
         <w:t xml:space="preserve"> </w:t>
       </w:r>
       <w:r>
-        <w:t xml:space="preserve">837</w:t>
-        <w:noBreakHyphen/>
-        <w:t xml:space="preserve">6999</w:t>
+        <w:t xml:space="preserve">837-⁠6999</w:t>
       </w:r>
     </w:p>
     <w:p>
@@ -2232,9 +2190,7 @@
         <w:t xml:space="preserve"> </w:t>
       </w:r>
       <w:r>
-        <w:t xml:space="preserve">429</w:t>
-        <w:noBreakHyphen/>
-        <w:t xml:space="preserve">6407</w:t>
+        <w:t xml:space="preserve">429-⁠6407</w:t>
       </w:r>
     </w:p>
     <w:p>
@@ -2368,9 +2324,7 @@
         <w:t xml:space="preserve"> </w:t>
       </w:r>
       <w:r>
-        <w:t xml:space="preserve">331</w:t>
-        <w:noBreakHyphen/>
-        <w:t xml:space="preserve">2121</w:t>
+        <w:t xml:space="preserve">331-⁠2121</w:t>
       </w:r>
     </w:p>
     <w:p>
@@ -3086,7 +3040,7 @@
     <w:qFormat/>
     <w:pPr>
       <w:keepLines/>
-      <w:spacing w:before="0" w:after="120" w:line="276" w:lineRule="exact"/>
+      <w:spacing w:before="26" w:after="120" w:line="276" w:lineRule="exact"/>
     </w:pPr>
     <w:rPr>
       <w:sz w:val="24"/>

</xml_diff>